<commit_message>
Add scenario D validation logic
</commit_message>
<xml_diff>
--- a/Priority_vs_SRTF_Report.docx
+++ b/Priority_vs_SRTF_Report.docx
@@ -50,7 +50,41 @@
           <w:sz w:val="52"/>
           <w:szCs w:val="52"/>
         </w:rPr>
-        <w:t>Priority Scheduling vs SRTF</w:t>
+        <w:t xml:space="preserve">Priority </w:t>
+      </w:r>
+      <w:proofErr w:type="gramStart"/>
+      <w:r>
+        <w:rPr>
+          <w:b/>
+          <w:bCs/>
+          <w:color w:val="1F3864"/>
+          <w:sz w:val="52"/>
+          <w:szCs w:val="52"/>
+        </w:rPr>
+        <w:t>Sc</w:t>
+      </w:r>
+      <w:bookmarkStart w:id="0" w:name="_GoBack"/>
+      <w:bookmarkEnd w:id="0"/>
+      <w:r>
+        <w:rPr>
+          <w:b/>
+          <w:bCs/>
+          <w:color w:val="1F3864"/>
+          <w:sz w:val="52"/>
+          <w:szCs w:val="52"/>
+        </w:rPr>
+        <w:t>heduling</w:t>
+      </w:r>
+      <w:proofErr w:type="gramEnd"/>
+      <w:r>
+        <w:rPr>
+          <w:b/>
+          <w:bCs/>
+          <w:color w:val="1F3864"/>
+          <w:sz w:val="52"/>
+          <w:szCs w:val="52"/>
+        </w:rPr>
+        <w:t xml:space="preserve"> vs SRTF</w:t>
       </w:r>
     </w:p>
     <w:tbl>
@@ -76,12 +110,6 @@
         <w:gridCol w:w="6919"/>
       </w:tblGrid>
       <w:tr>
-        <w:tblPrEx>
-          <w:tblCellMar>
-            <w:top w:w="0" w:type="dxa"/>
-            <w:bottom w:w="0" w:type="dxa"/>
-          </w:tblCellMar>
-        </w:tblPrEx>
         <w:trPr>
           <w:trHeight w:val="407"/>
         </w:trPr>
@@ -155,12 +183,6 @@
         </w:tc>
       </w:tr>
       <w:tr>
-        <w:tblPrEx>
-          <w:tblCellMar>
-            <w:top w:w="0" w:type="dxa"/>
-            <w:bottom w:w="0" w:type="dxa"/>
-          </w:tblCellMar>
-        </w:tblPrEx>
         <w:trPr>
           <w:trHeight w:val="386"/>
         </w:trPr>
@@ -226,12 +248,6 @@
         </w:tc>
       </w:tr>
       <w:tr>
-        <w:tblPrEx>
-          <w:tblCellMar>
-            <w:top w:w="0" w:type="dxa"/>
-            <w:bottom w:w="0" w:type="dxa"/>
-          </w:tblCellMar>
-        </w:tblPrEx>
         <w:trPr>
           <w:trHeight w:val="407"/>
         </w:trPr>
@@ -297,12 +313,6 @@
         </w:tc>
       </w:tr>
       <w:tr>
-        <w:tblPrEx>
-          <w:tblCellMar>
-            <w:top w:w="0" w:type="dxa"/>
-            <w:bottom w:w="0" w:type="dxa"/>
-          </w:tblCellMar>
-        </w:tblPrEx>
         <w:trPr>
           <w:trHeight w:val="407"/>
         </w:trPr>
@@ -368,12 +378,6 @@
         </w:tc>
       </w:tr>
       <w:tr>
-        <w:tblPrEx>
-          <w:tblCellMar>
-            <w:top w:w="0" w:type="dxa"/>
-            <w:bottom w:w="0" w:type="dxa"/>
-          </w:tblCellMar>
-        </w:tblPrEx>
         <w:trPr>
           <w:trHeight w:val="386"/>
         </w:trPr>
@@ -474,7 +478,21 @@
         <w:rPr>
           <w:color w:val="404040"/>
         </w:rPr>
-        <w:t>CPU scheduling is one of the fundamental responsibilities of an operating system. The scheduler determines which process in the ready queue is allocated the CPU at any given moment, directly influencing system responsiveness, resource utilization, fairness, and overall throughput.</w:t>
+        <w:t xml:space="preserve">CPU scheduling is one of the fundamental responsibilities of an operating system. The scheduler </w:t>
+      </w:r>
+      <w:proofErr w:type="gramStart"/>
+      <w:r>
+        <w:rPr>
+          <w:color w:val="404040"/>
+        </w:rPr>
+        <w:t>determines</w:t>
+      </w:r>
+      <w:proofErr w:type="gramEnd"/>
+      <w:r>
+        <w:rPr>
+          <w:color w:val="404040"/>
+        </w:rPr>
+        <w:t xml:space="preserve"> which process in the ready queue is allocated the CPU at any given moment, directly influencing system responsiveness, resource utilization, fairness, and overall throughput.</w:t>
       </w:r>
     </w:p>
     <w:p/>
@@ -511,7 +529,21 @@
         <w:rPr>
           <w:color w:val="404040"/>
         </w:rPr>
-        <w:t>assigns CPU time based on a predefined priority value associated with each process. The process with the highest priority (lowest numeric value in our convention) is selected first.</w:t>
+        <w:t xml:space="preserve">assigns CPU time based on a predefined priority value associated with each process. The process with the highest priority (lowest numeric value in our convention) </w:t>
+      </w:r>
+      <w:proofErr w:type="gramStart"/>
+      <w:r>
+        <w:rPr>
+          <w:color w:val="404040"/>
+        </w:rPr>
+        <w:t>is selected</w:t>
+      </w:r>
+      <w:proofErr w:type="gramEnd"/>
+      <w:r>
+        <w:rPr>
+          <w:color w:val="404040"/>
+        </w:rPr>
+        <w:t xml:space="preserve"> first.</w:t>
       </w:r>
     </w:p>
     <w:p>
@@ -548,7 +580,21 @@
         <w:rPr>
           <w:color w:val="404040"/>
         </w:rPr>
-        <w:t>The objective of this project is to implement both algorithms, execute them on identical workloads, and analyze the differences in terms of performance metrics (Waiting Time, Turnaround Time, Response Time), fairness, starvation risk, and practical suitability.</w:t>
+        <w:t xml:space="preserve">The objective of this project is to implement both algorithms, execute them on identical workloads, and analyze the differences in terms of performance metrics (Waiting Time, Turnaround Time, </w:t>
+      </w:r>
+      <w:proofErr w:type="gramStart"/>
+      <w:r>
+        <w:rPr>
+          <w:color w:val="404040"/>
+        </w:rPr>
+        <w:t>Response</w:t>
+      </w:r>
+      <w:proofErr w:type="gramEnd"/>
+      <w:r>
+        <w:rPr>
+          <w:color w:val="404040"/>
+        </w:rPr>
+        <w:t xml:space="preserve"> Time), fairness, starvation risk, and practical suitability.</w:t>
       </w:r>
     </w:p>
     <w:p/>
@@ -591,13 +637,23 @@
         <w:spacing w:before="40" w:after="40"/>
         <w:ind w:left="200" w:right="200"/>
       </w:pPr>
+      <w:proofErr w:type="gramStart"/>
       <w:r>
         <w:rPr>
           <w:color w:val="404040"/>
           <w:sz w:val="20"/>
           <w:szCs w:val="20"/>
         </w:rPr>
-        <w:t>when faced with the same workload? Which is fairer? Which is faster?</w:t>
+        <w:t>when</w:t>
+      </w:r>
+      <w:proofErr w:type="gramEnd"/>
+      <w:r>
+        <w:rPr>
+          <w:color w:val="404040"/>
+          <w:sz w:val="20"/>
+          <w:szCs w:val="20"/>
+        </w:rPr>
+        <w:t xml:space="preserve"> faced with the same workload? Which is fairer? Which is faster?</w:t>
       </w:r>
     </w:p>
     <w:p>
@@ -631,8 +687,13 @@
       <w:pPr>
         <w:pStyle w:val="Heading2"/>
       </w:pPr>
-      <w:r>
-        <w:t xml:space="preserve">2.1  Priority Scheduling </w:t>
+      <w:proofErr w:type="gramStart"/>
+      <w:r>
+        <w:t>2.1  Priority</w:t>
+      </w:r>
+      <w:proofErr w:type="gramEnd"/>
+      <w:r>
+        <w:t xml:space="preserve"> Scheduling </w:t>
       </w:r>
     </w:p>
     <w:p>
@@ -689,7 +750,21 @@
         <w:rPr>
           <w:color w:val="404040"/>
         </w:rPr>
-        <w:t>If two processes share the same priority, the tie is broken by Arrival Time (earlier arrival wins), then by Process ID.</w:t>
+        <w:t xml:space="preserve">If two processes share the same priority, </w:t>
+      </w:r>
+      <w:proofErr w:type="gramStart"/>
+      <w:r>
+        <w:rPr>
+          <w:color w:val="404040"/>
+        </w:rPr>
+        <w:t>the tie is broken by Arrival Time (earlier arrival wins)</w:t>
+      </w:r>
+      <w:proofErr w:type="gramEnd"/>
+      <w:r>
+        <w:rPr>
+          <w:color w:val="404040"/>
+        </w:rPr>
+        <w:t>, then by Process ID.</w:t>
       </w:r>
     </w:p>
     <w:p>
@@ -705,7 +780,21 @@
         <w:rPr>
           <w:color w:val="404040"/>
         </w:rPr>
-        <w:t>The scheduler is fully preemptive: if a newly arrived process has higher priority than the running process, it immediately preempts it.</w:t>
+        <w:t xml:space="preserve">The scheduler is </w:t>
+      </w:r>
+      <w:proofErr w:type="gramStart"/>
+      <w:r>
+        <w:rPr>
+          <w:color w:val="404040"/>
+        </w:rPr>
+        <w:t>fully preemptive</w:t>
+      </w:r>
+      <w:proofErr w:type="gramEnd"/>
+      <w:r>
+        <w:rPr>
+          <w:color w:val="404040"/>
+        </w:rPr>
+        <w:t>: if a newly arrived process has higher priority than the running process, it immediately preempts it.</w:t>
       </w:r>
     </w:p>
     <w:p>
@@ -750,8 +839,13 @@
       <w:pPr>
         <w:pStyle w:val="Heading2"/>
       </w:pPr>
-      <w:r>
-        <w:t>2.2  Shortest Remaining Time First (SRTF)</w:t>
+      <w:proofErr w:type="gramStart"/>
+      <w:r>
+        <w:t>2.2  Shortest</w:t>
+      </w:r>
+      <w:proofErr w:type="gramEnd"/>
+      <w:r>
+        <w:t xml:space="preserve"> Remaining Time First (SRTF)</w:t>
       </w:r>
     </w:p>
     <w:p>
@@ -763,7 +857,35 @@
         <w:rPr>
           <w:color w:val="404040"/>
         </w:rPr>
-        <w:t>SRTF is the preemptive counterpart of SJF. At every time unit, the process with the smallest remaining burst time is chosen. If a new process arrives whose burst time is less than the remaining time of the currently running process, the current process is preempted immediately.</w:t>
+        <w:t xml:space="preserve">SRTF is the preemptive counterpart of SJF. At every time unit, the process with the smallest remaining burst time </w:t>
+      </w:r>
+      <w:proofErr w:type="gramStart"/>
+      <w:r>
+        <w:rPr>
+          <w:color w:val="404040"/>
+        </w:rPr>
+        <w:t>is chosen</w:t>
+      </w:r>
+      <w:proofErr w:type="gramEnd"/>
+      <w:r>
+        <w:rPr>
+          <w:color w:val="404040"/>
+        </w:rPr>
+        <w:t xml:space="preserve">. If a new process arrives whose burst time is less than the remaining time of the currently running process, the current process </w:t>
+      </w:r>
+      <w:proofErr w:type="gramStart"/>
+      <w:r>
+        <w:rPr>
+          <w:color w:val="404040"/>
+        </w:rPr>
+        <w:t>is preempted</w:t>
+      </w:r>
+      <w:proofErr w:type="gramEnd"/>
+      <w:r>
+        <w:rPr>
+          <w:color w:val="404040"/>
+        </w:rPr>
+        <w:t xml:space="preserve"> immediately.</w:t>
       </w:r>
     </w:p>
     <w:p/>
@@ -808,7 +930,21 @@
         <w:rPr>
           <w:color w:val="404040"/>
         </w:rPr>
-        <w:t>Ties in remaining burst time are resolved by Arrival Time, then by Process ID.</w:t>
+        <w:t xml:space="preserve">Ties in remaining burst time </w:t>
+      </w:r>
+      <w:proofErr w:type="gramStart"/>
+      <w:r>
+        <w:rPr>
+          <w:color w:val="404040"/>
+        </w:rPr>
+        <w:t>are resolved</w:t>
+      </w:r>
+      <w:proofErr w:type="gramEnd"/>
+      <w:r>
+        <w:rPr>
+          <w:color w:val="404040"/>
+        </w:rPr>
+        <w:t xml:space="preserve"> by Arrival Time, then by Process ID.</w:t>
       </w:r>
     </w:p>
     <w:p>
@@ -837,7 +973,21 @@
         <w:rPr>
           <w:color w:val="404040"/>
         </w:rPr>
-        <w:t>Starvation Risk: Long processes may be indefinitely postponed if short processes keep arriving.</w:t>
+        <w:t xml:space="preserve">Starvation Risk: Long processes </w:t>
+      </w:r>
+      <w:proofErr w:type="gramStart"/>
+      <w:r>
+        <w:rPr>
+          <w:color w:val="404040"/>
+        </w:rPr>
+        <w:t>may be indefinitely postponed</w:t>
+      </w:r>
+      <w:proofErr w:type="gramEnd"/>
+      <w:r>
+        <w:rPr>
+          <w:color w:val="404040"/>
+        </w:rPr>
+        <w:t xml:space="preserve"> if short processes keep arriving.</w:t>
       </w:r>
     </w:p>
     <w:p>
@@ -876,8 +1026,13 @@
       <w:pPr>
         <w:pStyle w:val="Heading2"/>
       </w:pPr>
-      <w:r>
-        <w:t>3.1  Technology Stack</w:t>
+      <w:proofErr w:type="gramStart"/>
+      <w:r>
+        <w:t>3.1  Technology</w:t>
+      </w:r>
+      <w:proofErr w:type="gramEnd"/>
+      <w:r>
+        <w:t xml:space="preserve"> Stack</w:t>
       </w:r>
     </w:p>
     <w:p>
@@ -935,8 +1090,13 @@
       <w:pPr>
         <w:pStyle w:val="Heading2"/>
       </w:pPr>
-      <w:r>
-        <w:t>3.2  System Architecture</w:t>
+      <w:proofErr w:type="gramStart"/>
+      <w:r>
+        <w:t>3.2  System</w:t>
+      </w:r>
+      <w:proofErr w:type="gramEnd"/>
+      <w:r>
+        <w:t xml:space="preserve"> Architecture</w:t>
       </w:r>
     </w:p>
     <w:p>
@@ -948,7 +1108,21 @@
         <w:rPr>
           <w:color w:val="404040"/>
         </w:rPr>
-        <w:t>The simulator is organized into the following modules:</w:t>
+        <w:t xml:space="preserve">The simulator </w:t>
+      </w:r>
+      <w:proofErr w:type="gramStart"/>
+      <w:r>
+        <w:rPr>
+          <w:color w:val="404040"/>
+        </w:rPr>
+        <w:t>is organized</w:t>
+      </w:r>
+      <w:proofErr w:type="gramEnd"/>
+      <w:r>
+        <w:rPr>
+          <w:color w:val="404040"/>
+        </w:rPr>
+        <w:t xml:space="preserve"> into the following modules:</w:t>
       </w:r>
     </w:p>
     <w:p>
@@ -1038,7 +1212,25 @@
           <w:bCs/>
           <w:color w:val="404040"/>
         </w:rPr>
-        <w:t xml:space="preserve">Gantt Chart Renderer: </w:t>
+        <w:t xml:space="preserve">Gantt </w:t>
+      </w:r>
+      <w:proofErr w:type="gramStart"/>
+      <w:r>
+        <w:rPr>
+          <w:b/>
+          <w:bCs/>
+          <w:color w:val="404040"/>
+        </w:rPr>
+        <w:t>Chart</w:t>
+      </w:r>
+      <w:proofErr w:type="gramEnd"/>
+      <w:r>
+        <w:rPr>
+          <w:b/>
+          <w:bCs/>
+          <w:color w:val="404040"/>
+        </w:rPr>
+        <w:t xml:space="preserve"> Renderer: </w:t>
       </w:r>
       <w:r>
         <w:rPr>
@@ -1068,7 +1260,21 @@
         <w:rPr>
           <w:color w:val="404040"/>
         </w:rPr>
-        <w:t>computes WT, TAT, RT per process and calculates averages.</w:t>
+        <w:t xml:space="preserve">computes WT, TAT, </w:t>
+      </w:r>
+      <w:proofErr w:type="gramStart"/>
+      <w:r>
+        <w:rPr>
+          <w:color w:val="404040"/>
+        </w:rPr>
+        <w:t>RT</w:t>
+      </w:r>
+      <w:proofErr w:type="gramEnd"/>
+      <w:r>
+        <w:rPr>
+          <w:color w:val="404040"/>
+        </w:rPr>
+        <w:t xml:space="preserve"> per process and calculates averages.</w:t>
       </w:r>
     </w:p>
     <w:p>
@@ -1099,9 +1305,11 @@
       <w:pPr>
         <w:pStyle w:val="Heading2"/>
       </w:pPr>
+      <w:proofErr w:type="gramStart"/>
       <w:r>
         <w:t>3.3  Assumptions</w:t>
       </w:r>
+      <w:proofErr w:type="gramEnd"/>
     </w:p>
     <w:p>
       <w:pPr>
@@ -1144,11 +1352,19 @@
         </w:numPr>
         <w:spacing w:before="60" w:after="60"/>
       </w:pPr>
-      <w:r>
-        <w:rPr>
-          <w:color w:val="404040"/>
-        </w:rPr>
-        <w:t>Tie-breaking for equal priority or equal remaining time: earlier arrival time, then lower Process ID.</w:t>
+      <w:proofErr w:type="gramStart"/>
+      <w:r>
+        <w:rPr>
+          <w:color w:val="404040"/>
+        </w:rPr>
+        <w:t>Tie-breaking</w:t>
+      </w:r>
+      <w:proofErr w:type="gramEnd"/>
+      <w:r>
+        <w:rPr>
+          <w:color w:val="404040"/>
+        </w:rPr>
+        <w:t xml:space="preserve"> for equal priority or equal remaining time: earlier arrival time, then lower Process ID.</w:t>
       </w:r>
     </w:p>
     <w:p>
@@ -1197,8 +1413,13 @@
       <w:pPr>
         <w:pStyle w:val="Heading2"/>
       </w:pPr>
-      <w:r>
-        <w:t>3.4  Input Validation</w:t>
+      <w:proofErr w:type="gramStart"/>
+      <w:r>
+        <w:t>3.4  Input</w:t>
+      </w:r>
+      <w:proofErr w:type="gramEnd"/>
+      <w:r>
+        <w:t xml:space="preserve"> Validation</w:t>
       </w:r>
     </w:p>
     <w:tbl>
@@ -1223,12 +1444,6 @@
         <w:gridCol w:w="5360"/>
       </w:tblGrid>
       <w:tr>
-        <w:tblPrEx>
-          <w:tblCellMar>
-            <w:top w:w="0" w:type="dxa"/>
-            <w:bottom w:w="0" w:type="dxa"/>
-          </w:tblCellMar>
-        </w:tblPrEx>
         <w:tc>
           <w:tcPr>
             <w:tcW w:w="4000" w:type="dxa"/>
@@ -1299,12 +1514,6 @@
         </w:tc>
       </w:tr>
       <w:tr>
-        <w:tblPrEx>
-          <w:tblCellMar>
-            <w:top w:w="0" w:type="dxa"/>
-            <w:bottom w:w="0" w:type="dxa"/>
-          </w:tblCellMar>
-        </w:tblPrEx>
         <w:tc>
           <w:tcPr>
             <w:tcW w:w="4000" w:type="dxa"/>
@@ -1365,12 +1574,6 @@
         </w:tc>
       </w:tr>
       <w:tr>
-        <w:tblPrEx>
-          <w:tblCellMar>
-            <w:top w:w="0" w:type="dxa"/>
-            <w:bottom w:w="0" w:type="dxa"/>
-          </w:tblCellMar>
-        </w:tblPrEx>
         <w:tc>
           <w:tcPr>
             <w:tcW w:w="4000" w:type="dxa"/>
@@ -1431,12 +1634,6 @@
         </w:tc>
       </w:tr>
       <w:tr>
-        <w:tblPrEx>
-          <w:tblCellMar>
-            <w:top w:w="0" w:type="dxa"/>
-            <w:bottom w:w="0" w:type="dxa"/>
-          </w:tblCellMar>
-        </w:tblPrEx>
         <w:tc>
           <w:tcPr>
             <w:tcW w:w="4000" w:type="dxa"/>
@@ -1497,12 +1694,6 @@
         </w:tc>
       </w:tr>
       <w:tr>
-        <w:tblPrEx>
-          <w:tblCellMar>
-            <w:top w:w="0" w:type="dxa"/>
-            <w:bottom w:w="0" w:type="dxa"/>
-          </w:tblCellMar>
-        </w:tblPrEx>
         <w:tc>
           <w:tcPr>
             <w:tcW w:w="4000" w:type="dxa"/>
@@ -1563,12 +1754,6 @@
         </w:tc>
       </w:tr>
       <w:tr>
-        <w:tblPrEx>
-          <w:tblCellMar>
-            <w:top w:w="0" w:type="dxa"/>
-            <w:bottom w:w="0" w:type="dxa"/>
-          </w:tblCellMar>
-        </w:tblPrEx>
         <w:tc>
           <w:tcPr>
             <w:tcW w:w="4000" w:type="dxa"/>
@@ -1629,12 +1814,6 @@
         </w:tc>
       </w:tr>
       <w:tr>
-        <w:tblPrEx>
-          <w:tblCellMar>
-            <w:top w:w="0" w:type="dxa"/>
-            <w:bottom w:w="0" w:type="dxa"/>
-          </w:tblCellMar>
-        </w:tblPrEx>
         <w:tc>
           <w:tcPr>
             <w:tcW w:w="4000" w:type="dxa"/>
@@ -1717,7 +1896,35 @@
         <w:rPr>
           <w:color w:val="404040"/>
         </w:rPr>
-        <w:t>All four test scenarios were executed using identical process inputs for both algorithms. Results, Gantt charts, and metrics are presented separately for each algorithm.</w:t>
+        <w:t xml:space="preserve">All </w:t>
+      </w:r>
+      <w:proofErr w:type="gramStart"/>
+      <w:r>
+        <w:rPr>
+          <w:color w:val="404040"/>
+        </w:rPr>
+        <w:t>four test</w:t>
+      </w:r>
+      <w:proofErr w:type="gramEnd"/>
+      <w:r>
+        <w:rPr>
+          <w:color w:val="404040"/>
+        </w:rPr>
+        <w:t xml:space="preserve"> scenarios were executed using identical process inputs for both algorithms. Results, Gantt charts, and metrics </w:t>
+      </w:r>
+      <w:proofErr w:type="gramStart"/>
+      <w:r>
+        <w:rPr>
+          <w:color w:val="404040"/>
+        </w:rPr>
+        <w:t>are presented</w:t>
+      </w:r>
+      <w:proofErr w:type="gramEnd"/>
+      <w:r>
+        <w:rPr>
+          <w:color w:val="404040"/>
+        </w:rPr>
+        <w:t xml:space="preserve"> separately for each algorithm.</w:t>
       </w:r>
     </w:p>
     <w:p>
@@ -1732,6 +1939,11 @@
       <w:pPr>
         <w:spacing w:before="80" w:after="100"/>
         <w:jc w:val="both"/>
+        <w:rPr>
+          <w:rFonts w:hint="cs"/>
+          <w:rtl/>
+          <w:lang w:bidi="ar-EG"/>
+        </w:rPr>
       </w:pPr>
       <w:r>
         <w:rPr>
@@ -1740,16 +1952,24 @@
         <w:t>A standard workload with varied arrival times, burst times, and priorities to evaluate baseline behavior of both algorithms.</w:t>
       </w:r>
     </w:p>
-    <w:p>
-      <w:r>
+    <w:p/>
+    <w:p/>
+    <w:p>
+      <w:pPr>
         <w:rPr>
           <w:noProof/>
+          <w:rtl/>
+        </w:rPr>
+      </w:pPr>
+      <w:r>
+        <w:rPr>
+          <w:noProof/>
         </w:rPr>
         <w:drawing>
-          <wp:inline distT="0" distB="0" distL="0" distR="0" wp14:anchorId="34263093" wp14:editId="382245DA">
-            <wp:extent cx="3009900" cy="2947934"/>
-            <wp:effectExtent l="0" t="0" r="0" b="5080"/>
-            <wp:docPr id="1" name="Picture 1"/>
+          <wp:inline distT="0" distB="0" distL="0" distR="0" wp14:anchorId="4FADED4D" wp14:editId="5E758E32">
+            <wp:extent cx="3193952" cy="2742734"/>
+            <wp:effectExtent l="0" t="0" r="6985" b="635"/>
+            <wp:docPr id="8" name="Picture 8"/>
             <wp:cNvGraphicFramePr>
               <a:graphicFrameLocks xmlns:a="http://schemas.openxmlformats.org/drawingml/2006/main" noChangeAspect="1"/>
             </wp:cNvGraphicFramePr>
@@ -1757,7 +1977,7 @@
               <a:graphicData uri="http://schemas.openxmlformats.org/drawingml/2006/picture">
                 <pic:pic xmlns:pic="http://schemas.openxmlformats.org/drawingml/2006/picture">
                   <pic:nvPicPr>
-                    <pic:cNvPr id="1" name="screencapture-file-C-Users-Alaa-Downloads-c1-priority-vs-srtf-2-html-2026-05-03-17_37_20.png"/>
+                    <pic:cNvPr id="8" name="screencapture-file-C-Users-Alaa-albdreq-eladad-index-html-2026-05-09-21_56_20.png"/>
                     <pic:cNvPicPr/>
                   </pic:nvPicPr>
                   <pic:blipFill rotWithShape="1">
@@ -1768,13 +1988,13 @@
                         </a:ext>
                       </a:extLst>
                     </a:blip>
-                    <a:srcRect l="15008" r="15590"/>
+                    <a:srcRect l="16851" t="4481" r="16915" b="1892"/>
                     <a:stretch/>
                   </pic:blipFill>
                   <pic:spPr bwMode="auto">
                     <a:xfrm>
                       <a:off x="0" y="0"/>
-                      <a:ext cx="3009900" cy="2947934"/>
+                      <a:ext cx="3231421" cy="2774910"/>
                     </a:xfrm>
                     <a:prstGeom prst="rect">
                       <a:avLst/>
@@ -1797,12 +2017,13 @@
       <w:r>
         <w:rPr>
           <w:noProof/>
+          <w:rtl/>
         </w:rPr>
         <w:drawing>
-          <wp:inline distT="0" distB="0" distL="0" distR="0">
-            <wp:extent cx="3208655" cy="2937632"/>
+          <wp:inline distT="0" distB="0" distL="0" distR="0" wp14:anchorId="37A25D4D" wp14:editId="6AE21189">
+            <wp:extent cx="2942492" cy="2712975"/>
             <wp:effectExtent l="0" t="0" r="0" b="0"/>
-            <wp:docPr id="3" name="Picture 3"/>
+            <wp:docPr id="16" name="Picture 16"/>
             <wp:cNvGraphicFramePr>
               <a:graphicFrameLocks xmlns:a="http://schemas.openxmlformats.org/drawingml/2006/main" noChangeAspect="1"/>
             </wp:cNvGraphicFramePr>
@@ -1810,7 +2031,7 @@
               <a:graphicData uri="http://schemas.openxmlformats.org/drawingml/2006/picture">
                 <pic:pic xmlns:pic="http://schemas.openxmlformats.org/drawingml/2006/picture">
                   <pic:nvPicPr>
-                    <pic:cNvPr id="3" name="screencapture-file-C-Users-Alaa-Downloads-c1-priority-vs-srtf-2-html-2026-05-03-17_37_58.png"/>
+                    <pic:cNvPr id="16" name="screencapture-file-C-Users-Alaa-albdreq-eladad-index-html-2026-05-09-21_56_55.png"/>
                     <pic:cNvPicPr/>
                   </pic:nvPicPr>
                   <pic:blipFill rotWithShape="1">
@@ -1821,13 +2042,13 @@
                         </a:ext>
                       </a:extLst>
                     </a:blip>
-                    <a:srcRect l="14553" t="48457" r="13628" b="2496"/>
+                    <a:srcRect l="16489" t="43592" r="16092" b="4747"/>
                     <a:stretch/>
                   </pic:blipFill>
                   <pic:spPr bwMode="auto">
                     <a:xfrm>
                       <a:off x="0" y="0"/>
-                      <a:ext cx="3235384" cy="2962103"/>
+                      <a:ext cx="2945840" cy="2716061"/>
                     </a:xfrm>
                     <a:prstGeom prst="rect">
                       <a:avLst/>
@@ -1850,12 +2071,13 @@
       <w:r>
         <w:rPr>
           <w:noProof/>
+          <w:rtl/>
         </w:rPr>
         <w:drawing>
           <wp:inline distT="0" distB="0" distL="0" distR="0">
-            <wp:extent cx="4343399" cy="1608667"/>
-            <wp:effectExtent l="0" t="0" r="635" b="0"/>
-            <wp:docPr id="4" name="Picture 4"/>
+            <wp:extent cx="3193415" cy="1500452"/>
+            <wp:effectExtent l="0" t="0" r="6985" b="5080"/>
+            <wp:docPr id="17" name="Picture 17"/>
             <wp:cNvGraphicFramePr>
               <a:graphicFrameLocks xmlns:a="http://schemas.openxmlformats.org/drawingml/2006/main" noChangeAspect="1"/>
             </wp:cNvGraphicFramePr>
@@ -1863,7 +2085,7 @@
               <a:graphicData uri="http://schemas.openxmlformats.org/drawingml/2006/picture">
                 <pic:pic xmlns:pic="http://schemas.openxmlformats.org/drawingml/2006/picture">
                   <pic:nvPicPr>
-                    <pic:cNvPr id="4" name="screencapture-file-C-Users-Alaa-Downloads-c1-priority-vs-srtf-2-html-2026-05-03-17_38_25.png"/>
+                    <pic:cNvPr id="17" name="screencapture-file-C-Users-Alaa-albdreq-eladad-index-html-2026-05-09-21_57_07.png"/>
                     <pic:cNvPicPr/>
                   </pic:nvPicPr>
                   <pic:blipFill rotWithShape="1">
@@ -1874,13 +2096,13 @@
                         </a:ext>
                       </a:extLst>
                     </a:blip>
-                    <a:srcRect l="15082" t="54372" r="17053" b="19537"/>
+                    <a:srcRect l="16309" t="51632" r="18079" b="19553"/>
                     <a:stretch/>
                   </pic:blipFill>
                   <pic:spPr bwMode="auto">
                     <a:xfrm>
                       <a:off x="0" y="0"/>
-                      <a:ext cx="4343951" cy="1608871"/>
+                      <a:ext cx="3193415" cy="1500452"/>
                     </a:xfrm>
                     <a:prstGeom prst="rect">
                       <a:avLst/>
@@ -1900,18 +2122,23 @@
           </wp:inline>
         </w:drawing>
       </w:r>
-    </w:p>
-    <w:p/>
-    <w:p>
       <w:r>
         <w:rPr>
           <w:noProof/>
+          <w:rtl/>
+        </w:rPr>
+        <w:t xml:space="preserve"> </w:t>
+      </w:r>
+      <w:r>
+        <w:rPr>
+          <w:noProof/>
+          <w:rtl/>
         </w:rPr>
         <w:drawing>
-          <wp:inline distT="0" distB="0" distL="0" distR="0" wp14:anchorId="6A37DFFB" wp14:editId="7C989AD6">
-            <wp:extent cx="6341110" cy="1854078"/>
-            <wp:effectExtent l="0" t="0" r="2540" b="0"/>
-            <wp:docPr id="2" name="Picture 2"/>
+          <wp:inline distT="0" distB="0" distL="0" distR="0">
+            <wp:extent cx="4253877" cy="1641231"/>
+            <wp:effectExtent l="0" t="0" r="0" b="0"/>
+            <wp:docPr id="15" name="Picture 15"/>
             <wp:cNvGraphicFramePr>
               <a:graphicFrameLocks xmlns:a="http://schemas.openxmlformats.org/drawingml/2006/main" noChangeAspect="1"/>
             </wp:cNvGraphicFramePr>
@@ -1919,24 +2146,24 @@
               <a:graphicData uri="http://schemas.openxmlformats.org/drawingml/2006/picture">
                 <pic:pic xmlns:pic="http://schemas.openxmlformats.org/drawingml/2006/picture">
                   <pic:nvPicPr>
-                    <pic:cNvPr id="2" name="screencapture-file-C-Users-Alaa-Downloads-c1-priority-vs-srtf-2-html-2026-05-03-17_37_43.png"/>
+                    <pic:cNvPr id="15" name="screencapture-file-C-Users-Alaa-albdreq-eladad-index-html-2026-05-09-21_56_43.png"/>
                     <pic:cNvPicPr/>
                   </pic:nvPicPr>
                   <pic:blipFill rotWithShape="1">
-                    <a:blip r:embed="rId10">
+                    <a:blip r:embed="rId10" cstate="print">
                       <a:extLst>
                         <a:ext uri="{28A0092B-C50C-407E-A947-70E740481C1C}">
                           <a14:useLocalDpi xmlns:a14="http://schemas.microsoft.com/office/drawing/2010/main" val="0"/>
                         </a:ext>
                       </a:extLst>
                     </a:blip>
-                    <a:srcRect l="14285" t="60637" r="15001" b="-645"/>
+                    <a:srcRect l="16398" t="57376" r="17105" b="4800"/>
                     <a:stretch/>
                   </pic:blipFill>
                   <pic:spPr bwMode="auto">
                     <a:xfrm>
                       <a:off x="0" y="0"/>
-                      <a:ext cx="6384078" cy="1866641"/>
+                      <a:ext cx="4256406" cy="1642207"/>
                     </a:xfrm>
                     <a:prstGeom prst="rect">
                       <a:avLst/>
@@ -1959,11 +2186,28 @@
     </w:p>
     <w:p>
       <w:pPr>
+        <w:rPr>
+          <w:noProof/>
+          <w:rtl/>
+        </w:rPr>
+      </w:pPr>
+    </w:p>
+    <w:p/>
+    <w:p>
+      <w:pPr>
         <w:pStyle w:val="Heading2"/>
       </w:pPr>
       <w:r>
         <w:lastRenderedPageBreak/>
-        <w:t>Scenario B: Conflict Between Priority and Burst Time</w:t>
+        <w:t xml:space="preserve">Scenario B: Conflict </w:t>
+      </w:r>
+      <w:proofErr w:type="gramStart"/>
+      <w:r>
+        <w:t>Between</w:t>
+      </w:r>
+      <w:proofErr w:type="gramEnd"/>
+      <w:r>
+        <w:t xml:space="preserve"> Priority and Burst Time</w:t>
       </w:r>
     </w:p>
     <w:p>
@@ -1978,7 +2222,21 @@
         <w:rPr>
           <w:color w:val="404040"/>
         </w:rPr>
-        <w:t>This scenario is designed to highlight the fundamental difference between the two algorithms. A high-priority process has a very long burst time, while a low-priority process has a very short burst time. The two schedulers make completely different decisions.</w:t>
+        <w:t xml:space="preserve">This scenario </w:t>
+      </w:r>
+      <w:proofErr w:type="gramStart"/>
+      <w:r>
+        <w:rPr>
+          <w:color w:val="404040"/>
+        </w:rPr>
+        <w:t>is designed</w:t>
+      </w:r>
+      <w:proofErr w:type="gramEnd"/>
+      <w:r>
+        <w:rPr>
+          <w:color w:val="404040"/>
+        </w:rPr>
+        <w:t xml:space="preserve"> to highlight the fundamental difference between the two algorithms. A high-priority process has a very long burst time, while a low-priority process has a very short burst time. The two schedulers make completely different decisions.</w:t>
       </w:r>
     </w:p>
     <w:p>
@@ -1986,17 +2244,15 @@
         <w:spacing w:before="80" w:after="100"/>
         <w:jc w:val="both"/>
       </w:pPr>
-    </w:p>
-    <w:p>
       <w:r>
         <w:rPr>
           <w:noProof/>
         </w:rPr>
         <w:drawing>
-          <wp:inline distT="0" distB="0" distL="0" distR="0" wp14:anchorId="4F2507D3" wp14:editId="5AAA0CA2">
-            <wp:extent cx="2642124" cy="2825750"/>
-            <wp:effectExtent l="0" t="0" r="6350" b="0"/>
-            <wp:docPr id="5" name="Picture 5"/>
+          <wp:inline distT="0" distB="0" distL="0" distR="0">
+            <wp:extent cx="2948305" cy="2915920"/>
+            <wp:effectExtent l="0" t="0" r="4445" b="0"/>
+            <wp:docPr id="20" name="Picture 20"/>
             <wp:cNvGraphicFramePr>
               <a:graphicFrameLocks xmlns:a="http://schemas.openxmlformats.org/drawingml/2006/main" noChangeAspect="1"/>
             </wp:cNvGraphicFramePr>
@@ -2004,7 +2260,7 @@
               <a:graphicData uri="http://schemas.openxmlformats.org/drawingml/2006/picture">
                 <pic:pic xmlns:pic="http://schemas.openxmlformats.org/drawingml/2006/picture">
                   <pic:nvPicPr>
-                    <pic:cNvPr id="5" name="screencapture-file-C-Users-Alaa-Downloads-c1-priority-vs-srtf-3-1-html-2026-05-03-18_51_52.png"/>
+                    <pic:cNvPr id="20" name="screencapture-file-C-Users-Alaa-albdreq-eladad-index-html-2026-05-09-22_12_56.png"/>
                     <pic:cNvPicPr/>
                   </pic:nvPicPr>
                   <pic:blipFill rotWithShape="1">
@@ -2015,13 +2271,13 @@
                         </a:ext>
                       </a:extLst>
                     </a:blip>
-                    <a:srcRect l="15551" t="14175" r="15358" b="16835"/>
+                    <a:srcRect l="16484" t="4551" r="16645" b="5235"/>
                     <a:stretch/>
                   </pic:blipFill>
                   <pic:spPr bwMode="auto">
                     <a:xfrm>
                       <a:off x="0" y="0"/>
-                      <a:ext cx="2669402" cy="2854924"/>
+                      <a:ext cx="2964946" cy="2932378"/>
                     </a:xfrm>
                     <a:prstGeom prst="rect">
                       <a:avLst/>
@@ -2045,17 +2301,11 @@
         <w:rPr>
           <w:noProof/>
         </w:rPr>
-        <w:t xml:space="preserve"> </w:t>
-      </w:r>
-      <w:r>
-        <w:rPr>
-          <w:noProof/>
-        </w:rPr>
         <w:drawing>
-          <wp:inline distT="0" distB="0" distL="0" distR="0" wp14:anchorId="52E101CB" wp14:editId="1D0EBCF6">
-            <wp:extent cx="3646715" cy="2833618"/>
-            <wp:effectExtent l="0" t="0" r="0" b="5080"/>
-            <wp:docPr id="7" name="Picture 7"/>
+          <wp:inline distT="0" distB="0" distL="0" distR="0">
+            <wp:extent cx="3140710" cy="3063240"/>
+            <wp:effectExtent l="0" t="0" r="2540" b="3810"/>
+            <wp:docPr id="21" name="Picture 21"/>
             <wp:cNvGraphicFramePr>
               <a:graphicFrameLocks xmlns:a="http://schemas.openxmlformats.org/drawingml/2006/main" noChangeAspect="1"/>
             </wp:cNvGraphicFramePr>
@@ -2063,7 +2313,7 @@
               <a:graphicData uri="http://schemas.openxmlformats.org/drawingml/2006/picture">
                 <pic:pic xmlns:pic="http://schemas.openxmlformats.org/drawingml/2006/picture">
                   <pic:nvPicPr>
-                    <pic:cNvPr id="7" name="screencapture-file-C-Users-Alaa-Downloads-c1-priority-vs-srtf-3-1-html-2026-05-03-18_52_29.png"/>
+                    <pic:cNvPr id="21" name="screencapture-file-C-Users-Alaa-albdreq-eladad-index-html-2026-05-09-22_13_24.png"/>
                     <pic:cNvPicPr/>
                   </pic:nvPicPr>
                   <pic:blipFill rotWithShape="1">
@@ -2074,13 +2324,13 @@
                         </a:ext>
                       </a:extLst>
                     </a:blip>
-                    <a:srcRect l="15803" t="48298" r="16636" b="14321"/>
+                    <a:srcRect l="15752" t="44275" r="16643" b="4636"/>
                     <a:stretch/>
                   </pic:blipFill>
                   <pic:spPr bwMode="auto">
                     <a:xfrm>
                       <a:off x="0" y="0"/>
-                      <a:ext cx="3659534" cy="2843579"/>
+                      <a:ext cx="3188835" cy="3110178"/>
                     </a:xfrm>
                     <a:prstGeom prst="rect">
                       <a:avLst/>
@@ -2100,15 +2350,17 @@
           </wp:inline>
         </w:drawing>
       </w:r>
+    </w:p>
+    <w:p>
       <w:r>
         <w:rPr>
           <w:noProof/>
         </w:rPr>
         <w:drawing>
           <wp:inline distT="0" distB="0" distL="0" distR="0">
-            <wp:extent cx="4233962" cy="1778000"/>
-            <wp:effectExtent l="0" t="0" r="0" b="0"/>
-            <wp:docPr id="9" name="Picture 9"/>
+            <wp:extent cx="3733800" cy="1899920"/>
+            <wp:effectExtent l="0" t="0" r="0" b="5080"/>
+            <wp:docPr id="22" name="Picture 22"/>
             <wp:cNvGraphicFramePr>
               <a:graphicFrameLocks xmlns:a="http://schemas.openxmlformats.org/drawingml/2006/main" noChangeAspect="1"/>
             </wp:cNvGraphicFramePr>
@@ -2116,7 +2368,7 @@
               <a:graphicData uri="http://schemas.openxmlformats.org/drawingml/2006/picture">
                 <pic:pic xmlns:pic="http://schemas.openxmlformats.org/drawingml/2006/picture">
                   <pic:nvPicPr>
-                    <pic:cNvPr id="9" name="screencapture-file-C-Users-Alaa-Downloads-c1-priority-vs-srtf-3-1-html-2026-05-03-18_52_40.png"/>
+                    <pic:cNvPr id="22" name="screencapture-file-C-Users-Alaa-albdreq-eladad-index-html-2026-05-09-22_13_43.png"/>
                     <pic:cNvPicPr/>
                   </pic:nvPicPr>
                   <pic:blipFill rotWithShape="1">
@@ -2127,13 +2379,13 @@
                         </a:ext>
                       </a:extLst>
                     </a:blip>
-                    <a:srcRect l="15139" t="47647" r="18670" b="26386"/>
+                    <a:srcRect l="16219" t="43611" r="16917" b="19786"/>
                     <a:stretch/>
                   </pic:blipFill>
                   <pic:spPr bwMode="auto">
                     <a:xfrm>
                       <a:off x="0" y="0"/>
-                      <a:ext cx="4243214" cy="1781885"/>
+                      <a:ext cx="3773360" cy="1920050"/>
                     </a:xfrm>
                     <a:prstGeom prst="rect">
                       <a:avLst/>
@@ -2155,19 +2407,22 @@
       </w:r>
     </w:p>
     <w:p/>
-    <w:p/>
-    <w:p/>
-    <w:p/>
-    <w:p>
-      <w:r>
+    <w:p>
+      <w:pPr>
         <w:rPr>
           <w:noProof/>
+          <w:rtl/>
+        </w:rPr>
+      </w:pPr>
+      <w:r>
+        <w:rPr>
+          <w:noProof/>
         </w:rPr>
         <w:drawing>
-          <wp:inline distT="0" distB="0" distL="0" distR="0" wp14:anchorId="257950AE" wp14:editId="3A18DE7B">
-            <wp:extent cx="5842000" cy="1778000"/>
-            <wp:effectExtent l="0" t="0" r="6350" b="0"/>
-            <wp:docPr id="6" name="Picture 6"/>
+          <wp:inline distT="0" distB="0" distL="0" distR="0" wp14:anchorId="2E57D100" wp14:editId="79F9B321">
+            <wp:extent cx="4683760" cy="1767840"/>
+            <wp:effectExtent l="0" t="0" r="2540" b="3810"/>
+            <wp:docPr id="19" name="Picture 19"/>
             <wp:cNvGraphicFramePr>
               <a:graphicFrameLocks xmlns:a="http://schemas.openxmlformats.org/drawingml/2006/main" noChangeAspect="1"/>
             </wp:cNvGraphicFramePr>
@@ -2175,24 +2430,24 @@
               <a:graphicData uri="http://schemas.openxmlformats.org/drawingml/2006/picture">
                 <pic:pic xmlns:pic="http://schemas.openxmlformats.org/drawingml/2006/picture">
                   <pic:nvPicPr>
-                    <pic:cNvPr id="6" name="screencapture-file-C-Users-Alaa-Downloads-c1-priority-vs-srtf-3-1-html-2026-05-03-18_52_16.png"/>
+                    <pic:cNvPr id="19" name="screencapture-file-C-Users-Alaa-albdreq-eladad-index-html-2026-05-09-22_13_15.png"/>
                     <pic:cNvPicPr/>
                   </pic:nvPicPr>
                   <pic:blipFill rotWithShape="1">
-                    <a:blip r:embed="rId14">
+                    <a:blip r:embed="rId14" cstate="print">
                       <a:extLst>
                         <a:ext uri="{28A0092B-C50C-407E-A947-70E740481C1C}">
                           <a14:useLocalDpi xmlns:a14="http://schemas.microsoft.com/office/drawing/2010/main" val="0"/>
                         </a:ext>
                       </a:extLst>
                     </a:blip>
-                    <a:srcRect l="15803" t="57574" r="17081" b="16441"/>
+                    <a:srcRect l="16129" t="55935" r="16430" b="3064"/>
                     <a:stretch/>
                   </pic:blipFill>
                   <pic:spPr bwMode="auto">
                     <a:xfrm>
                       <a:off x="0" y="0"/>
-                      <a:ext cx="5843939" cy="1778590"/>
+                      <a:ext cx="4688608" cy="1769670"/>
                     </a:xfrm>
                     <a:prstGeom prst="rect">
                       <a:avLst/>
@@ -2215,10 +2470,26 @@
     </w:p>
     <w:p>
       <w:pPr>
+        <w:rPr>
+          <w:noProof/>
+          <w:rtl/>
+        </w:rPr>
+      </w:pPr>
+    </w:p>
+    <w:p>
+      <w:pPr>
+        <w:rPr>
+          <w:noProof/>
+          <w:rtl/>
+        </w:rPr>
+      </w:pPr>
+    </w:p>
+    <w:p/>
+    <w:p>
+      <w:pPr>
         <w:pStyle w:val="Heading2"/>
       </w:pPr>
       <w:r>
-        <w:lastRenderedPageBreak/>
         <w:t>Scenario C: Starvation-Sensitive Case</w:t>
       </w:r>
     </w:p>
@@ -2245,10 +2516,18 @@
           <w:noProof/>
         </w:rPr>
         <w:drawing>
-          <wp:inline distT="0" distB="0" distL="0" distR="0">
-            <wp:extent cx="2944091" cy="2943566"/>
-            <wp:effectExtent l="0" t="0" r="8890" b="9525"/>
-            <wp:docPr id="10" name="Picture 10"/>
+          <wp:anchor distT="0" distB="0" distL="114300" distR="114300" simplePos="0" relativeHeight="251658240" behindDoc="0" locked="0" layoutInCell="1" allowOverlap="1">
+            <wp:simplePos x="0" y="0"/>
+            <wp:positionH relativeFrom="margin">
+              <wp:align>left</wp:align>
+            </wp:positionH>
+            <wp:positionV relativeFrom="paragraph">
+              <wp:posOffset>158750</wp:posOffset>
+            </wp:positionV>
+            <wp:extent cx="3063240" cy="2819400"/>
+            <wp:effectExtent l="0" t="0" r="3810" b="0"/>
+            <wp:wrapSquare wrapText="bothSides"/>
+            <wp:docPr id="23" name="Picture 23"/>
             <wp:cNvGraphicFramePr>
               <a:graphicFrameLocks xmlns:a="http://schemas.openxmlformats.org/drawingml/2006/main" noChangeAspect="1"/>
             </wp:cNvGraphicFramePr>
@@ -2256,7 +2535,7 @@
               <a:graphicData uri="http://schemas.openxmlformats.org/drawingml/2006/picture">
                 <pic:pic xmlns:pic="http://schemas.openxmlformats.org/drawingml/2006/picture">
                   <pic:nvPicPr>
-                    <pic:cNvPr id="10" name="screencapture-file-C-Users-Alaa-Downloads-c1-priority-vs-srtf-3-1-html-2026-05-03-19_03_47.png"/>
+                    <pic:cNvPr id="23" name="screencapture-file-C-Users-Alaa-albdreq-eladad-index-html-2026-05-09-22_20_40.png"/>
                     <pic:cNvPicPr/>
                   </pic:nvPicPr>
                   <pic:blipFill rotWithShape="1">
@@ -2267,13 +2546,83 @@
                         </a:ext>
                       </a:extLst>
                     </a:blip>
-                    <a:srcRect l="16630" t="13297" r="16312" b="15770"/>
+                    <a:srcRect l="16309" t="4494" r="16429" b="5286"/>
                     <a:stretch/>
                   </pic:blipFill>
                   <pic:spPr bwMode="auto">
                     <a:xfrm>
                       <a:off x="0" y="0"/>
-                      <a:ext cx="2975356" cy="2974826"/>
+                      <a:ext cx="3063240" cy="2819400"/>
+                    </a:xfrm>
+                    <a:prstGeom prst="rect">
+                      <a:avLst/>
+                    </a:prstGeom>
+                    <a:ln>
+                      <a:noFill/>
+                    </a:ln>
+                    <a:extLst>
+                      <a:ext uri="{53640926-AAD7-44D8-BBD7-CCE9431645EC}">
+                        <a14:shadowObscured xmlns:a14="http://schemas.microsoft.com/office/drawing/2010/main"/>
+                      </a:ext>
+                    </a:extLst>
+                  </pic:spPr>
+                </pic:pic>
+              </a:graphicData>
+            </a:graphic>
+            <wp14:sizeRelV relativeFrom="margin">
+              <wp14:pctHeight>0</wp14:pctHeight>
+            </wp14:sizeRelV>
+          </wp:anchor>
+        </w:drawing>
+      </w:r>
+      <w:r>
+        <w:rPr>
+          <w:noProof/>
+        </w:rPr>
+        <w:t xml:space="preserve"> </w:t>
+      </w:r>
+    </w:p>
+    <w:p>
+      <w:pPr>
+        <w:rPr>
+          <w:noProof/>
+          <w:rtl/>
+        </w:rPr>
+      </w:pPr>
+      <w:r>
+        <w:rPr>
+          <w:noProof/>
+        </w:rPr>
+        <w:drawing>
+          <wp:inline distT="0" distB="0" distL="0" distR="0">
+            <wp:extent cx="3002280" cy="2796540"/>
+            <wp:effectExtent l="0" t="0" r="7620" b="3810"/>
+            <wp:docPr id="25" name="Picture 25"/>
+            <wp:cNvGraphicFramePr>
+              <a:graphicFrameLocks xmlns:a="http://schemas.openxmlformats.org/drawingml/2006/main" noChangeAspect="1"/>
+            </wp:cNvGraphicFramePr>
+            <a:graphic xmlns:a="http://schemas.openxmlformats.org/drawingml/2006/main">
+              <a:graphicData uri="http://schemas.openxmlformats.org/drawingml/2006/picture">
+                <pic:pic xmlns:pic="http://schemas.openxmlformats.org/drawingml/2006/picture">
+                  <pic:nvPicPr>
+                    <pic:cNvPr id="25" name="screencapture-file-C-Users-Alaa-albdreq-eladad-index-html-2026-05-09-22_21_04.png"/>
+                    <pic:cNvPicPr/>
+                  </pic:nvPicPr>
+                  <pic:blipFill rotWithShape="1">
+                    <a:blip r:embed="rId16" cstate="print">
+                      <a:extLst>
+                        <a:ext uri="{28A0092B-C50C-407E-A947-70E740481C1C}">
+                          <a14:useLocalDpi xmlns:a14="http://schemas.microsoft.com/office/drawing/2010/main" val="0"/>
+                        </a:ext>
+                      </a:extLst>
+                    </a:blip>
+                    <a:srcRect l="16071" t="43604" r="16190" b="4676"/>
+                    <a:stretch/>
+                  </pic:blipFill>
+                  <pic:spPr bwMode="auto">
+                    <a:xfrm>
+                      <a:off x="0" y="0"/>
+                      <a:ext cx="3002280" cy="2796540"/>
                     </a:xfrm>
                     <a:prstGeom prst="rect">
                       <a:avLst/>
@@ -2293,21 +2642,32 @@
           </wp:inline>
         </w:drawing>
       </w:r>
-      <w:r>
+    </w:p>
+    <w:p>
+      <w:pPr>
         <w:rPr>
           <w:noProof/>
-        </w:rPr>
-        <w:t xml:space="preserve"> </w:t>
-      </w:r>
-      <w:r>
+          <w:rtl/>
+        </w:rPr>
+      </w:pPr>
+    </w:p>
+    <w:p>
+      <w:pPr>
         <w:rPr>
           <w:noProof/>
+          <w:rtl/>
+        </w:rPr>
+      </w:pPr>
+      <w:r>
+        <w:rPr>
+          <w:noProof/>
+          <w:rtl/>
         </w:rPr>
         <w:drawing>
-          <wp:inline distT="0" distB="0" distL="0" distR="0" wp14:anchorId="48302B30" wp14:editId="7AF59A8A">
-            <wp:extent cx="3325091" cy="2949927"/>
-            <wp:effectExtent l="0" t="0" r="8890" b="3175"/>
-            <wp:docPr id="12" name="Picture 12"/>
+          <wp:inline distT="0" distB="0" distL="0" distR="0">
+            <wp:extent cx="3893820" cy="1866900"/>
+            <wp:effectExtent l="0" t="0" r="0" b="0"/>
+            <wp:docPr id="26" name="Picture 26"/>
             <wp:cNvGraphicFramePr>
               <a:graphicFrameLocks xmlns:a="http://schemas.openxmlformats.org/drawingml/2006/main" noChangeAspect="1"/>
             </wp:cNvGraphicFramePr>
@@ -2315,24 +2675,24 @@
               <a:graphicData uri="http://schemas.openxmlformats.org/drawingml/2006/picture">
                 <pic:pic xmlns:pic="http://schemas.openxmlformats.org/drawingml/2006/picture">
                   <pic:nvPicPr>
-                    <pic:cNvPr id="12" name="screencapture-file-C-Users-Alaa-Downloads-c1-priority-vs-srtf-3-1-html-2026-05-03-19_04_12.png"/>
+                    <pic:cNvPr id="26" name="screencapture-file-C-Users-Alaa-albdreq-eladad-index-html-2026-05-09-22_21_18.png"/>
                     <pic:cNvPicPr/>
                   </pic:nvPicPr>
                   <pic:blipFill rotWithShape="1">
-                    <a:blip r:embed="rId16" cstate="print">
+                    <a:blip r:embed="rId17" cstate="print">
                       <a:extLst>
                         <a:ext uri="{28A0092B-C50C-407E-A947-70E740481C1C}">
                           <a14:useLocalDpi xmlns:a14="http://schemas.microsoft.com/office/drawing/2010/main" val="0"/>
                         </a:ext>
                       </a:extLst>
                     </a:blip>
-                    <a:srcRect l="16454" t="47451" r="16747" b="14300"/>
+                    <a:srcRect l="15714" t="46064" r="16428" b="18109"/>
                     <a:stretch/>
                   </pic:blipFill>
                   <pic:spPr bwMode="auto">
                     <a:xfrm>
                       <a:off x="0" y="0"/>
-                      <a:ext cx="3385443" cy="3003469"/>
+                      <a:ext cx="3893820" cy="1866900"/>
                     </a:xfrm>
                     <a:prstGeom prst="rect">
                       <a:avLst/>
@@ -2352,15 +2712,31 @@
           </wp:inline>
         </w:drawing>
       </w:r>
-      <w:r>
+    </w:p>
+    <w:p>
+      <w:pPr>
         <w:rPr>
           <w:noProof/>
+          <w:rtl/>
+        </w:rPr>
+      </w:pPr>
+    </w:p>
+    <w:p>
+      <w:pPr>
+        <w:rPr>
+          <w:noProof/>
+          <w:rtl/>
+        </w:rPr>
+      </w:pPr>
+      <w:r>
+        <w:rPr>
+          <w:noProof/>
         </w:rPr>
         <w:drawing>
-          <wp:inline distT="0" distB="0" distL="0" distR="0">
-            <wp:extent cx="4200525" cy="1866900"/>
-            <wp:effectExtent l="0" t="0" r="9525" b="0"/>
-            <wp:docPr id="13" name="Picture 13"/>
+          <wp:inline distT="0" distB="0" distL="0" distR="0" wp14:anchorId="6AF495F0" wp14:editId="4428FD91">
+            <wp:extent cx="4876800" cy="1699260"/>
+            <wp:effectExtent l="0" t="0" r="0" b="0"/>
+            <wp:docPr id="24" name="Picture 24"/>
             <wp:cNvGraphicFramePr>
               <a:graphicFrameLocks xmlns:a="http://schemas.openxmlformats.org/drawingml/2006/main" noChangeAspect="1"/>
             </wp:cNvGraphicFramePr>
@@ -2368,24 +2744,24 @@
               <a:graphicData uri="http://schemas.openxmlformats.org/drawingml/2006/picture">
                 <pic:pic xmlns:pic="http://schemas.openxmlformats.org/drawingml/2006/picture">
                   <pic:nvPicPr>
-                    <pic:cNvPr id="13" name="screencapture-file-C-Users-Alaa-Downloads-c1-priority-vs-srtf-3-1-html-2026-05-03-19_04_22.png"/>
+                    <pic:cNvPr id="24" name="screencapture-file-C-Users-Alaa-albdreq-eladad-index-html-2026-05-09-22_20_51.png"/>
                     <pic:cNvPicPr/>
                   </pic:nvPicPr>
                   <pic:blipFill rotWithShape="1">
-                    <a:blip r:embed="rId17" cstate="print">
+                    <a:blip r:embed="rId18" cstate="print">
                       <a:extLst>
                         <a:ext uri="{28A0092B-C50C-407E-A947-70E740481C1C}">
                           <a14:useLocalDpi xmlns:a14="http://schemas.microsoft.com/office/drawing/2010/main" val="0"/>
                         </a:ext>
                       </a:extLst>
                     </a:blip>
-                    <a:srcRect l="16666" t="49531" r="17709" b="25829"/>
+                    <a:srcRect l="15714" t="55559" r="16428" b="4984"/>
                     <a:stretch/>
                   </pic:blipFill>
                   <pic:spPr bwMode="auto">
                     <a:xfrm>
                       <a:off x="0" y="0"/>
-                      <a:ext cx="4200525" cy="1866900"/>
+                      <a:ext cx="4876800" cy="1699260"/>
                     </a:xfrm>
                     <a:prstGeom prst="rect">
                       <a:avLst/>
@@ -2410,19 +2786,70 @@
       <w:pPr>
         <w:rPr>
           <w:noProof/>
-        </w:rPr>
-      </w:pPr>
-    </w:p>
-    <w:p>
-      <w:r>
+          <w:rtl/>
+        </w:rPr>
+      </w:pPr>
+    </w:p>
+    <w:p>
+      <w:pPr>
+        <w:pStyle w:val="Heading2"/>
+      </w:pPr>
+      <w:r>
+        <w:lastRenderedPageBreak/>
+        <w:t>Scenario D: Input Validation Case</w:t>
+      </w:r>
+    </w:p>
+    <w:p>
+      <w:pPr>
+        <w:spacing w:before="80" w:after="100"/>
+        <w:jc w:val="both"/>
+      </w:pPr>
+      <w:r>
+        <w:rPr>
+          <w:color w:val="404040"/>
+        </w:rPr>
+        <w:t xml:space="preserve">This scenario demonstrates how the simulator handles invalid input. The following data </w:t>
+      </w:r>
+      <w:proofErr w:type="gramStart"/>
+      <w:r>
+        <w:rPr>
+          <w:color w:val="404040"/>
+        </w:rPr>
+        <w:t>was entered</w:t>
+      </w:r>
+      <w:proofErr w:type="gramEnd"/>
+      <w:r>
+        <w:rPr>
+          <w:color w:val="404040"/>
+        </w:rPr>
+        <w:t xml:space="preserve"> deliberately to test rejection behavior.</w:t>
+      </w:r>
+    </w:p>
+    <w:p>
+      <w:pPr>
         <w:rPr>
           <w:noProof/>
+          <w:rtl/>
+        </w:rPr>
+      </w:pPr>
+    </w:p>
+    <w:p>
+      <w:pPr>
+        <w:rPr>
+          <w:noProof/>
+          <w:rtl/>
+        </w:rPr>
+      </w:pPr>
+      <w:r>
+        <w:rPr>
+          <w:noProof/>
+          <w:rtl/>
         </w:rPr>
         <w:drawing>
           <wp:inline distT="0" distB="0" distL="0" distR="0">
-            <wp:extent cx="6457950" cy="2190750"/>
-            <wp:effectExtent l="0" t="0" r="0" b="0"/>
-            <wp:docPr id="11" name="Picture 11"/>
+            <wp:extent cx="6337300" cy="3136900"/>
+            <wp:effectExtent l="0" t="0" r="6350" b="6350"/>
+            <wp:docPr id="27" name="Picture 27"/>
             <wp:cNvGraphicFramePr>
               <a:graphicFrameLocks xmlns:a="http://schemas.openxmlformats.org/drawingml/2006/main" noChangeAspect="1"/>
             </wp:cNvGraphicFramePr>
@@ -2430,24 +2857,24 @@
               <a:graphicData uri="http://schemas.openxmlformats.org/drawingml/2006/picture">
                 <pic:pic xmlns:pic="http://schemas.openxmlformats.org/drawingml/2006/picture">
                   <pic:nvPicPr>
-                    <pic:cNvPr id="11" name="screencapture-file-C-Users-Alaa-Downloads-c1-priority-vs-srtf-3-1-html-2026-05-03-19_04_00.png"/>
+                    <pic:cNvPr id="27" name="screencapture-file-C-Users-Alaa-albdreq-eladad-index-html-2026-05-09-22_28_45.png"/>
                     <pic:cNvPicPr/>
                   </pic:nvPicPr>
                   <pic:blipFill rotWithShape="1">
-                    <a:blip r:embed="rId18">
+                    <a:blip r:embed="rId19">
                       <a:extLst>
                         <a:ext uri="{28A0092B-C50C-407E-A947-70E740481C1C}">
                           <a14:useLocalDpi xmlns:a14="http://schemas.microsoft.com/office/drawing/2010/main" val="0"/>
                         </a:ext>
                       </a:extLst>
                     </a:blip>
-                    <a:srcRect l="16454" t="57560" r="16639" b="16082"/>
+                    <a:srcRect l="15774" t="6834" r="15873" b="13854"/>
                     <a:stretch/>
                   </pic:blipFill>
                   <pic:spPr bwMode="auto">
                     <a:xfrm>
                       <a:off x="0" y="0"/>
-                      <a:ext cx="6462333" cy="2192237"/>
+                      <a:ext cx="6337300" cy="3136900"/>
                     </a:xfrm>
                     <a:prstGeom prst="rect">
                       <a:avLst/>
@@ -2468,14 +2895,206 @@
         </w:drawing>
       </w:r>
     </w:p>
+    <w:p>
+      <w:pPr>
+        <w:rPr>
+          <w:noProof/>
+          <w:rtl/>
+        </w:rPr>
+      </w:pPr>
+    </w:p>
+    <w:p>
+      <w:pPr>
+        <w:rPr>
+          <w:noProof/>
+          <w:rtl/>
+        </w:rPr>
+      </w:pPr>
+    </w:p>
+    <w:p>
+      <w:pPr>
+        <w:rPr>
+          <w:noProof/>
+          <w:rtl/>
+        </w:rPr>
+      </w:pPr>
+    </w:p>
+    <w:p>
+      <w:pPr>
+        <w:rPr>
+          <w:noProof/>
+        </w:rPr>
+      </w:pPr>
+    </w:p>
     <w:p/>
     <w:p>
       <w:pPr>
+        <w:rPr>
+          <w:rtl/>
+        </w:rPr>
+      </w:pPr>
+    </w:p>
+    <w:p>
+      <w:pPr>
+        <w:rPr>
+          <w:rtl/>
+        </w:rPr>
+      </w:pPr>
+    </w:p>
+    <w:p>
+      <w:pPr>
+        <w:rPr>
+          <w:rtl/>
+        </w:rPr>
+      </w:pPr>
+    </w:p>
+    <w:p>
+      <w:pPr>
+        <w:rPr>
+          <w:rtl/>
+        </w:rPr>
+      </w:pPr>
+    </w:p>
+    <w:p>
+      <w:pPr>
+        <w:rPr>
+          <w:rtl/>
+        </w:rPr>
+      </w:pPr>
+    </w:p>
+    <w:p>
+      <w:pPr>
+        <w:rPr>
+          <w:rtl/>
+        </w:rPr>
+      </w:pPr>
+    </w:p>
+    <w:p>
+      <w:pPr>
+        <w:rPr>
+          <w:rtl/>
+        </w:rPr>
+      </w:pPr>
+    </w:p>
+    <w:p>
+      <w:pPr>
+        <w:rPr>
+          <w:rtl/>
+        </w:rPr>
+      </w:pPr>
+    </w:p>
+    <w:p>
+      <w:pPr>
+        <w:rPr>
+          <w:rtl/>
+        </w:rPr>
+      </w:pPr>
+    </w:p>
+    <w:p>
+      <w:pPr>
+        <w:rPr>
+          <w:rtl/>
+        </w:rPr>
+      </w:pPr>
+    </w:p>
+    <w:p>
+      <w:pPr>
+        <w:rPr>
+          <w:rtl/>
+        </w:rPr>
+      </w:pPr>
+    </w:p>
+    <w:p>
+      <w:pPr>
+        <w:rPr>
+          <w:rtl/>
+        </w:rPr>
+      </w:pPr>
+    </w:p>
+    <w:p>
+      <w:pPr>
+        <w:rPr>
+          <w:rtl/>
+        </w:rPr>
+      </w:pPr>
+    </w:p>
+    <w:p>
+      <w:pPr>
+        <w:rPr>
+          <w:rtl/>
+        </w:rPr>
+      </w:pPr>
+    </w:p>
+    <w:p>
+      <w:pPr>
+        <w:rPr>
+          <w:rtl/>
+        </w:rPr>
+      </w:pPr>
+    </w:p>
+    <w:p>
+      <w:pPr>
+        <w:rPr>
+          <w:rtl/>
+        </w:rPr>
+      </w:pPr>
+    </w:p>
+    <w:p>
+      <w:pPr>
+        <w:rPr>
+          <w:rtl/>
+        </w:rPr>
+      </w:pPr>
+    </w:p>
+    <w:p>
+      <w:pPr>
+        <w:rPr>
+          <w:rtl/>
+        </w:rPr>
+      </w:pPr>
+    </w:p>
+    <w:p>
+      <w:pPr>
+        <w:rPr>
+          <w:rtl/>
+        </w:rPr>
+      </w:pPr>
+    </w:p>
+    <w:p>
+      <w:pPr>
+        <w:rPr>
+          <w:rtl/>
+        </w:rPr>
+      </w:pPr>
+    </w:p>
+    <w:p>
+      <w:pPr>
+        <w:rPr>
+          <w:rtl/>
+        </w:rPr>
+      </w:pPr>
+    </w:p>
+    <w:p>
+      <w:pPr>
         <w:pStyle w:val="Heading2"/>
       </w:pPr>
+      <w:proofErr w:type="gramStart"/>
       <w:r>
         <w:lastRenderedPageBreak/>
-        <w:t>Scenario D: Input Validation Case</w:t>
+        <w:t>5.2  Answers</w:t>
+      </w:r>
+      <w:proofErr w:type="gramEnd"/>
+      <w:r>
+        <w:t xml:space="preserve"> to Required Analysis Questions</w:t>
+      </w:r>
+    </w:p>
+    <w:p/>
+    <w:p>
+      <w:pPr>
+        <w:pStyle w:val="Heading3"/>
+      </w:pPr>
+      <w:r>
+        <w:t>Which algorithm produced the lower average waiting time?</w:t>
       </w:r>
     </w:p>
     <w:p>
@@ -2487,94 +3106,30 @@
         <w:rPr>
           <w:color w:val="404040"/>
         </w:rPr>
-        <w:t>This scenario demonstrates how the simulator handles invalid input. The following data was entered deliberately to test rejection behavior.</w:t>
+        <w:t xml:space="preserve">SRTF produced a lower average waiting time in all three scenarios. This </w:t>
+      </w:r>
+      <w:proofErr w:type="gramStart"/>
+      <w:r>
+        <w:rPr>
+          <w:color w:val="404040"/>
+        </w:rPr>
+        <w:t>is expected</w:t>
+      </w:r>
+      <w:proofErr w:type="gramEnd"/>
+      <w:r>
+        <w:rPr>
+          <w:color w:val="404040"/>
+        </w:rPr>
+        <w:t>, as SRTF is theoretically optimal for minimizing average waiting time by always selecting the process closest to completion.</w:t>
       </w:r>
     </w:p>
     <w:p/>
-    <w:p/>
-    <w:p>
-      <w:r>
-        <w:rPr>
-          <w:noProof/>
-        </w:rPr>
-        <w:drawing>
-          <wp:inline distT="0" distB="0" distL="0" distR="0">
-            <wp:extent cx="6256655" cy="2912534"/>
-            <wp:effectExtent l="0" t="0" r="0" b="2540"/>
-            <wp:docPr id="14" name="Picture 14"/>
-            <wp:cNvGraphicFramePr>
-              <a:graphicFrameLocks xmlns:a="http://schemas.openxmlformats.org/drawingml/2006/main" noChangeAspect="1"/>
-            </wp:cNvGraphicFramePr>
-            <a:graphic xmlns:a="http://schemas.openxmlformats.org/drawingml/2006/main">
-              <a:graphicData uri="http://schemas.openxmlformats.org/drawingml/2006/picture">
-                <pic:pic xmlns:pic="http://schemas.openxmlformats.org/drawingml/2006/picture">
-                  <pic:nvPicPr>
-                    <pic:cNvPr id="14" name="screencapture-file-C-Users-Alaa-Downloads-c1-priority-vs-srtf-2-html-2026-05-03-19_13_13.png"/>
-                    <pic:cNvPicPr/>
-                  </pic:nvPicPr>
-                  <pic:blipFill rotWithShape="1">
-                    <a:blip r:embed="rId19">
-                      <a:extLst>
-                        <a:ext uri="{28A0092B-C50C-407E-A947-70E740481C1C}">
-                          <a14:useLocalDpi xmlns:a14="http://schemas.microsoft.com/office/drawing/2010/main" val="0"/>
-                        </a:ext>
-                      </a:extLst>
-                    </a:blip>
-                    <a:srcRect l="16006" t="5214" r="16763" b="7789"/>
-                    <a:stretch/>
-                  </pic:blipFill>
-                  <pic:spPr bwMode="auto">
-                    <a:xfrm>
-                      <a:off x="0" y="0"/>
-                      <a:ext cx="6290633" cy="2928351"/>
-                    </a:xfrm>
-                    <a:prstGeom prst="rect">
-                      <a:avLst/>
-                    </a:prstGeom>
-                    <a:ln>
-                      <a:noFill/>
-                    </a:ln>
-                    <a:extLst>
-                      <a:ext uri="{53640926-AAD7-44D8-BBD7-CCE9431645EC}">
-                        <a14:shadowObscured xmlns:a14="http://schemas.microsoft.com/office/drawing/2010/main"/>
-                      </a:ext>
-                    </a:extLst>
-                  </pic:spPr>
-                </pic:pic>
-              </a:graphicData>
-            </a:graphic>
-          </wp:inline>
-        </w:drawing>
-      </w:r>
-    </w:p>
-    <w:p/>
-    <w:p/>
-    <w:p/>
-    <w:p/>
-    <w:p/>
-    <w:p/>
-    <w:p/>
-    <w:p>
-      <w:r>
-        <w:br w:type="page"/>
-      </w:r>
-    </w:p>
-    <w:p>
-      <w:pPr>
-        <w:pStyle w:val="Heading2"/>
-      </w:pPr>
-      <w:r>
-        <w:lastRenderedPageBreak/>
-        <w:t>5.2  Answers to Required Analysis Questions</w:t>
-      </w:r>
-    </w:p>
-    <w:p/>
     <w:p>
       <w:pPr>
         <w:pStyle w:val="Heading3"/>
       </w:pPr>
       <w:r>
-        <w:t>Which algorithm produced the lower average waiting time?</w:t>
+        <w:t>Which algorithm produced the lower average response time?</w:t>
       </w:r>
     </w:p>
     <w:p>
@@ -2586,7 +3141,7 @@
         <w:rPr>
           <w:color w:val="404040"/>
         </w:rPr>
-        <w:t>SRTF produced a lower average waiting time in all three scenarios. This is expected, as SRTF is theoretically optimal for minimizing average waiting time by always selecting the process closest to completion.</w:t>
+        <w:t>SRTF also produced lower average response times across all scenarios. Because it always picks the shortest job, short processes gain CPU access very quickly, resulting in low response times. Priority Scheduling may delay short processes if a longer high-priority process is running.</w:t>
       </w:r>
     </w:p>
     <w:p/>
@@ -2595,7 +3150,7 @@
         <w:pStyle w:val="Heading3"/>
       </w:pPr>
       <w:r>
-        <w:t>Which algorithm produced the lower average response time?</w:t>
+        <w:t>Did priority values improve treatment of urgent processes?</w:t>
       </w:r>
     </w:p>
     <w:p>
@@ -2607,28 +3162,35 @@
         <w:rPr>
           <w:color w:val="404040"/>
         </w:rPr>
-        <w:t>SRTF also produced lower average response times across all scenarios. Because it always picks the shortest job, short processes gain CPU access very quickly, resulting in low response times. Priority Scheduling may delay short processes if a longer high-priority process is running.</w:t>
-      </w:r>
-    </w:p>
-    <w:p/>
-    <w:p>
-      <w:pPr>
-        <w:pStyle w:val="Heading3"/>
-      </w:pPr>
-      <w:r>
-        <w:t>Did priority values improve treatment of urgent processes?</w:t>
-      </w:r>
-    </w:p>
-    <w:p>
-      <w:pPr>
-        <w:spacing w:before="80" w:after="100"/>
-        <w:jc w:val="both"/>
-      </w:pPr>
-      <w:r>
-        <w:rPr>
-          <w:color w:val="404040"/>
-        </w:rPr>
-        <w:t>Yes, but with a cost. In Scenario B, the high-priority process P1 was guaranteed CPU access throughout its full 10-unit burst without interruption. This is beneficial for real-time or critical tasks where priority assignment carries semantic meaning. However, low-priority short processes were forced to wait significantly longer than under SRTF.</w:t>
+        <w:t xml:space="preserve">Yes, but with a cost. In Scenario B, the high-priority process P1 </w:t>
+      </w:r>
+      <w:proofErr w:type="gramStart"/>
+      <w:r>
+        <w:rPr>
+          <w:color w:val="404040"/>
+        </w:rPr>
+        <w:t>was guaranteed</w:t>
+      </w:r>
+      <w:proofErr w:type="gramEnd"/>
+      <w:r>
+        <w:rPr>
+          <w:color w:val="404040"/>
+        </w:rPr>
+        <w:t xml:space="preserve"> CPU access throughout its full 10-unit burst without interruption. This is beneficial for real-time or critical tasks where priority assignment carries semantic meaning. However, low-priority short processes </w:t>
+      </w:r>
+      <w:proofErr w:type="gramStart"/>
+      <w:r>
+        <w:rPr>
+          <w:color w:val="404040"/>
+        </w:rPr>
+        <w:t>were forced</w:t>
+      </w:r>
+      <w:proofErr w:type="gramEnd"/>
+      <w:r>
+        <w:rPr>
+          <w:color w:val="404040"/>
+        </w:rPr>
+        <w:t xml:space="preserve"> to wait significantly longer than under SRTF.</w:t>
       </w:r>
     </w:p>
     <w:p/>
@@ -2688,7 +3250,25 @@
           <w:bCs/>
           <w:color w:val="404040"/>
         </w:rPr>
-        <w:t xml:space="preserve">SRTF is recommended </w:t>
+        <w:t xml:space="preserve">SRTF </w:t>
+      </w:r>
+      <w:proofErr w:type="gramStart"/>
+      <w:r>
+        <w:rPr>
+          <w:b/>
+          <w:bCs/>
+          <w:color w:val="404040"/>
+        </w:rPr>
+        <w:t>is recommended</w:t>
+      </w:r>
+      <w:proofErr w:type="gramEnd"/>
+      <w:r>
+        <w:rPr>
+          <w:b/>
+          <w:bCs/>
+          <w:color w:val="404040"/>
+        </w:rPr>
+        <w:t xml:space="preserve"> </w:t>
       </w:r>
       <w:r>
         <w:rPr>
@@ -2728,11 +3308,22 @@
     </w:p>
     <w:p>
       <w:pPr>
+        <w:rPr>
+          <w:rtl/>
+        </w:rPr>
+      </w:pPr>
+    </w:p>
+    <w:p>
+      <w:pPr>
         <w:pStyle w:val="Heading2"/>
       </w:pPr>
-      <w:r>
-        <w:lastRenderedPageBreak/>
-        <w:t>5.3  Overall Algorithm Comparison</w:t>
+      <w:proofErr w:type="gramStart"/>
+      <w:r>
+        <w:t>5.3  Overall</w:t>
+      </w:r>
+      <w:proofErr w:type="gramEnd"/>
+      <w:r>
+        <w:t xml:space="preserve"> Algorithm Comparison</w:t>
       </w:r>
     </w:p>
     <w:p/>
@@ -2760,12 +3351,6 @@
         <w:gridCol w:w="4439"/>
       </w:tblGrid>
       <w:tr>
-        <w:tblPrEx>
-          <w:tblCellMar>
-            <w:top w:w="0" w:type="dxa"/>
-            <w:bottom w:w="0" w:type="dxa"/>
-          </w:tblCellMar>
-        </w:tblPrEx>
         <w:tc>
           <w:tcPr>
             <w:tcW w:w="3000" w:type="dxa"/>
@@ -2870,12 +3455,6 @@
         </w:tc>
       </w:tr>
       <w:tr>
-        <w:tblPrEx>
-          <w:tblCellMar>
-            <w:top w:w="0" w:type="dxa"/>
-            <w:bottom w:w="0" w:type="dxa"/>
-          </w:tblCellMar>
-        </w:tblPrEx>
         <w:tc>
           <w:tcPr>
             <w:tcW w:w="3000" w:type="dxa"/>
@@ -2967,12 +3546,6 @@
         </w:tc>
       </w:tr>
       <w:tr>
-        <w:tblPrEx>
-          <w:tblCellMar>
-            <w:top w:w="0" w:type="dxa"/>
-            <w:bottom w:w="0" w:type="dxa"/>
-          </w:tblCellMar>
-        </w:tblPrEx>
         <w:tc>
           <w:tcPr>
             <w:tcW w:w="3000" w:type="dxa"/>
@@ -3064,12 +3637,6 @@
         </w:tc>
       </w:tr>
       <w:tr>
-        <w:tblPrEx>
-          <w:tblCellMar>
-            <w:top w:w="0" w:type="dxa"/>
-            <w:bottom w:w="0" w:type="dxa"/>
-          </w:tblCellMar>
-        </w:tblPrEx>
         <w:tc>
           <w:tcPr>
             <w:tcW w:w="3000" w:type="dxa"/>
@@ -3161,12 +3728,6 @@
         </w:tc>
       </w:tr>
       <w:tr>
-        <w:tblPrEx>
-          <w:tblCellMar>
-            <w:top w:w="0" w:type="dxa"/>
-            <w:bottom w:w="0" w:type="dxa"/>
-          </w:tblCellMar>
-        </w:tblPrEx>
         <w:tc>
           <w:tcPr>
             <w:tcW w:w="3000" w:type="dxa"/>
@@ -3258,12 +3819,6 @@
         </w:tc>
       </w:tr>
       <w:tr>
-        <w:tblPrEx>
-          <w:tblCellMar>
-            <w:top w:w="0" w:type="dxa"/>
-            <w:bottom w:w="0" w:type="dxa"/>
-          </w:tblCellMar>
-        </w:tblPrEx>
         <w:tc>
           <w:tcPr>
             <w:tcW w:w="3000" w:type="dxa"/>
@@ -3355,12 +3910,6 @@
         </w:tc>
       </w:tr>
       <w:tr>
-        <w:tblPrEx>
-          <w:tblCellMar>
-            <w:top w:w="0" w:type="dxa"/>
-            <w:bottom w:w="0" w:type="dxa"/>
-          </w:tblCellMar>
-        </w:tblPrEx>
         <w:tc>
           <w:tcPr>
             <w:tcW w:w="3000" w:type="dxa"/>
@@ -3452,12 +4001,6 @@
         </w:tc>
       </w:tr>
       <w:tr>
-        <w:tblPrEx>
-          <w:tblCellMar>
-            <w:top w:w="0" w:type="dxa"/>
-            <w:bottom w:w="0" w:type="dxa"/>
-          </w:tblCellMar>
-        </w:tblPrEx>
         <w:tc>
           <w:tcPr>
             <w:tcW w:w="3000" w:type="dxa"/>
@@ -3549,12 +4092,6 @@
         </w:tc>
       </w:tr>
       <w:tr>
-        <w:tblPrEx>
-          <w:tblCellMar>
-            <w:top w:w="0" w:type="dxa"/>
-            <w:bottom w:w="0" w:type="dxa"/>
-          </w:tblCellMar>
-        </w:tblPrEx>
         <w:tc>
           <w:tcPr>
             <w:tcW w:w="3000" w:type="dxa"/>
@@ -3646,12 +4183,6 @@
         </w:tc>
       </w:tr>
       <w:tr>
-        <w:tblPrEx>
-          <w:tblCellMar>
-            <w:top w:w="0" w:type="dxa"/>
-            <w:bottom w:w="0" w:type="dxa"/>
-          </w:tblCellMar>
-        </w:tblPrEx>
         <w:tc>
           <w:tcPr>
             <w:tcW w:w="3000" w:type="dxa"/>
@@ -3760,8 +4291,13 @@
       <w:pPr>
         <w:pStyle w:val="Heading2"/>
       </w:pPr>
-      <w:r>
-        <w:t>6.1  Summary of Findings</w:t>
+      <w:proofErr w:type="gramStart"/>
+      <w:r>
+        <w:t>6.1  Summary</w:t>
+      </w:r>
+      <w:proofErr w:type="gramEnd"/>
+      <w:r>
+        <w:t xml:space="preserve"> of Findings</w:t>
       </w:r>
     </w:p>
     <w:p>
@@ -3874,13 +4410,18 @@
         <w:br w:type="page"/>
       </w:r>
     </w:p>
-    <w:p/>
     <w:p>
       <w:pPr>
         <w:pStyle w:val="Heading2"/>
       </w:pPr>
-      <w:r>
-        <w:t>6.2  Main Trade-Off Identified</w:t>
+      <w:proofErr w:type="gramStart"/>
+      <w:r>
+        <w:lastRenderedPageBreak/>
+        <w:t>6.2  Main</w:t>
+      </w:r>
+      <w:proofErr w:type="gramEnd"/>
+      <w:r>
+        <w:t xml:space="preserve"> Trade-Off Identified</w:t>
       </w:r>
     </w:p>
     <w:p>
@@ -3913,7 +4454,25 @@
           <w:sz w:val="20"/>
           <w:szCs w:val="20"/>
         </w:rPr>
-        <w:t>Priority Scheduling:   Policy correctness  vs  Higher waiting times</w:t>
+        <w:t xml:space="preserve">Priority Scheduling:   Policy </w:t>
+      </w:r>
+      <w:proofErr w:type="gramStart"/>
+      <w:r>
+        <w:rPr>
+          <w:color w:val="404040"/>
+          <w:sz w:val="20"/>
+          <w:szCs w:val="20"/>
+        </w:rPr>
+        <w:t>correctness  vs</w:t>
+      </w:r>
+      <w:proofErr w:type="gramEnd"/>
+      <w:r>
+        <w:rPr>
+          <w:color w:val="404040"/>
+          <w:sz w:val="20"/>
+          <w:szCs w:val="20"/>
+        </w:rPr>
+        <w:t xml:space="preserve">  Higher waiting times</w:t>
       </w:r>
     </w:p>
     <w:p>
@@ -3928,7 +4487,25 @@
           <w:sz w:val="20"/>
           <w:szCs w:val="20"/>
         </w:rPr>
-        <w:t>SRTF:                  Optimal efficiency  vs  Ignoring process urgency</w:t>
+        <w:t xml:space="preserve">SRTF:                  Optimal </w:t>
+      </w:r>
+      <w:proofErr w:type="gramStart"/>
+      <w:r>
+        <w:rPr>
+          <w:color w:val="404040"/>
+          <w:sz w:val="20"/>
+          <w:szCs w:val="20"/>
+        </w:rPr>
+        <w:t>efficiency  vs</w:t>
+      </w:r>
+      <w:proofErr w:type="gramEnd"/>
+      <w:r>
+        <w:rPr>
+          <w:color w:val="404040"/>
+          <w:sz w:val="20"/>
+          <w:szCs w:val="20"/>
+        </w:rPr>
+        <w:t xml:space="preserve">  Ignoring process urgency</w:t>
       </w:r>
     </w:p>
     <w:p>
@@ -3959,13 +4536,23 @@
         <w:spacing w:before="40" w:after="40"/>
         <w:ind w:left="200" w:right="200"/>
       </w:pPr>
+      <w:proofErr w:type="gramStart"/>
       <w:r>
         <w:rPr>
           <w:color w:val="404040"/>
           <w:sz w:val="20"/>
           <w:szCs w:val="20"/>
         </w:rPr>
-        <w:t>maximizing CPU throughput efficiency (shortest job first).</w:t>
+        <w:t>maximizing</w:t>
+      </w:r>
+      <w:proofErr w:type="gramEnd"/>
+      <w:r>
+        <w:rPr>
+          <w:color w:val="404040"/>
+          <w:sz w:val="20"/>
+          <w:szCs w:val="20"/>
+        </w:rPr>
+        <w:t xml:space="preserve"> CPU throughput efficiency (shortest job first).</w:t>
       </w:r>
     </w:p>
     <w:p/>
@@ -3973,8 +4560,13 @@
       <w:pPr>
         <w:pStyle w:val="Heading2"/>
       </w:pPr>
-      <w:r>
-        <w:t>6.3  Fairness Assessment</w:t>
+      <w:proofErr w:type="gramStart"/>
+      <w:r>
+        <w:t>6.3  Fairness</w:t>
+      </w:r>
+      <w:proofErr w:type="gramEnd"/>
+      <w:r>
+        <w:t xml:space="preserve"> Assessment</w:t>
       </w:r>
     </w:p>
     <w:p>
@@ -4034,12 +4626,85 @@
       </w:r>
     </w:p>
     <w:p>
-      <w:bookmarkStart w:id="0" w:name="_GoBack"/>
-      <w:bookmarkEnd w:id="0"/>
       <w:r>
         <w:br w:type="page"/>
       </w:r>
     </w:p>
+    <w:p>
+      <w:pPr>
+        <w:rPr>
+          <w:rtl/>
+        </w:rPr>
+      </w:pPr>
+    </w:p>
+    <w:p>
+      <w:pPr>
+        <w:rPr>
+          <w:rtl/>
+        </w:rPr>
+      </w:pPr>
+    </w:p>
+    <w:p>
+      <w:pPr>
+        <w:rPr>
+          <w:rtl/>
+        </w:rPr>
+      </w:pPr>
+    </w:p>
+    <w:p>
+      <w:pPr>
+        <w:rPr>
+          <w:rtl/>
+        </w:rPr>
+      </w:pPr>
+    </w:p>
+    <w:p>
+      <w:pPr>
+        <w:rPr>
+          <w:rtl/>
+        </w:rPr>
+      </w:pPr>
+    </w:p>
+    <w:p>
+      <w:pPr>
+        <w:rPr>
+          <w:rtl/>
+        </w:rPr>
+      </w:pPr>
+    </w:p>
+    <w:p>
+      <w:pPr>
+        <w:rPr>
+          <w:rtl/>
+        </w:rPr>
+      </w:pPr>
+    </w:p>
+    <w:p>
+      <w:pPr>
+        <w:rPr>
+          <w:rtl/>
+        </w:rPr>
+      </w:pPr>
+    </w:p>
+    <w:p>
+      <w:pPr>
+        <w:rPr>
+          <w:rtl/>
+        </w:rPr>
+      </w:pPr>
+    </w:p>
+    <w:p>
+      <w:pPr>
+        <w:rPr>
+          <w:rtl/>
+        </w:rPr>
+      </w:pPr>
+    </w:p>
+    <w:p/>
+    <w:p/>
+    <w:p/>
+    <w:p/>
+    <w:p/>
     <w:p/>
     <w:sectPr>
       <w:headerReference w:type="default" r:id="rId20"/>
@@ -4120,7 +4785,7 @@
       <w:rPr>
         <w:noProof/>
       </w:rPr>
-      <w:t>4</w:t>
+      <w:t>11</w:t>
     </w:r>
     <w:r>
       <w:fldChar w:fldCharType="end"/>
@@ -4163,7 +4828,25 @@
         <w:sz w:val="18"/>
         <w:szCs w:val="18"/>
       </w:rPr>
-      <w:t>Operating Systems Course  |  Priority vs SRTF Comparison Project  |  C1</w:t>
+      <w:t xml:space="preserve">Operating Systems </w:t>
+    </w:r>
+    <w:proofErr w:type="gramStart"/>
+    <w:r>
+      <w:rPr>
+        <w:color w:val="2E75B6"/>
+        <w:sz w:val="18"/>
+        <w:szCs w:val="18"/>
+      </w:rPr>
+      <w:t>Course  |</w:t>
+    </w:r>
+    <w:proofErr w:type="gramEnd"/>
+    <w:r>
+      <w:rPr>
+        <w:color w:val="2E75B6"/>
+        <w:sz w:val="18"/>
+        <w:szCs w:val="18"/>
+      </w:rPr>
+      <w:t xml:space="preserve">  Priority vs SRTF Comparison Project  |  C1</w:t>
     </w:r>
   </w:p>
 </w:hdr>

</xml_diff>